<commit_message>
Test plan file Updated
</commit_message>
<xml_diff>
--- a/Test_Plan_Draft.docx
+++ b/Test_Plan_Draft.docx
@@ -4091,13 +4091,8 @@
         <w:t xml:space="preserve">• </w:t>
       </w:r>
       <w:r>
-        <w:t xml:space="preserve">Functional testing of all </w:t>
-      </w:r>
-      <w:proofErr w:type="spellStart"/>
-      <w:r>
-        <w:t>FRs.</w:t>
-      </w:r>
-      <w:proofErr w:type="spellEnd"/>
+        <w:t>Functional testing of all FRs.</w:t>
+      </w:r>
     </w:p>
     <w:p>
       <w:pPr>
@@ -13859,21 +13854,13 @@
               <w:spacing w:after="60"/>
             </w:pPr>
             <w:r>
-              <w:t>Pallavi J (</w:t>
-            </w:r>
-            <w:r>
-              <w:t>PES1UG24CS313</w:t>
-            </w:r>
-            <w:proofErr w:type="gramStart"/>
+              <w:t>Pallavi J (PES1UG24CS313) ,  Rakshita Muttur (PES1UG24CS</w:t>
+            </w:r>
+            <w:r>
+              <w:t>366</w:t>
+            </w:r>
             <w:r>
               <w:t>)</w:t>
-            </w:r>
-            <w:r>
-              <w:t xml:space="preserve"> ,</w:t>
-            </w:r>
-            <w:proofErr w:type="gramEnd"/>
-            <w:r>
-              <w:t xml:space="preserve">  Rakshita Muttur (PES1UG24CS)</w:t>
             </w:r>
           </w:p>
         </w:tc>

</xml_diff>